<commit_message>
docs: add deployment verification chapter (0.7) - monitor DO app, verify GitHub connection, test live deployment
</commit_message>
<xml_diff>
--- a/TOKENSCOPE-DEPLOYMENT-GUIDE.docx
+++ b/TOKENSCOPE-DEPLOYMENT-GUIDE.docx
@@ -609,6 +609,376 @@
     <w:p>
       <w:r>
         <w:t>|------|-----|</w:t>
+      </w:r>
+    </w:p>
+    <w:p/>
+    <w:p>
+      <w:pPr>
+        <w:pStyle w:val="Heading3"/>
+      </w:pPr>
+      <w:r>
+        <w:t>0.7 Current Status &amp; First Deployment Verification</w:t>
+      </w:r>
+    </w:p>
+    <w:p>
+      <w:r>
+        <w:rPr>
+          <w:b/>
+        </w:rPr>
+        <w:t>Step 1: Find TokenScope App in DigitalOcean</w:t>
+      </w:r>
+    </w:p>
+    <w:p>
+      <w:pPr>
+        <w:pStyle w:val="NoSpacing"/>
+      </w:pPr>
+      <w:r>
+        <w:rPr>
+          <w:rFonts w:ascii="Courier New" w:hAnsi="Courier New"/>
+          <w:color w:val="404040"/>
+          <w:sz w:val="18"/>
+        </w:rPr>
+        <w:t>Go to: https://cloud.digitalocean.com/apps</w:t>
+        <w:br/>
+        <w:t>Look for: "tokenscope" in the Apps list</w:t>
+        <w:br/>
+        <w:t>You should see:</w:t>
+        <w:br/>
+        <w:t xml:space="preserve">  - App name: tokenscope</w:t>
+        <w:br/>
+        <w:t xml:space="preserve">  - Deployment status: "Deployed X days ago"</w:t>
+        <w:br/>
+        <w:t xml:space="preserve">  - Service: "1 Web Service"</w:t>
+      </w:r>
+    </w:p>
+    <w:p>
+      <w:r>
+        <w:rPr>
+          <w:b/>
+        </w:rPr>
+        <w:t>Step 2: View App Details</w:t>
+      </w:r>
+    </w:p>
+    <w:p>
+      <w:pPr>
+        <w:pStyle w:val="NoSpacing"/>
+      </w:pPr>
+      <w:r>
+        <w:rPr>
+          <w:rFonts w:ascii="Courier New" w:hAnsi="Courier New"/>
+          <w:color w:val="404040"/>
+          <w:sz w:val="18"/>
+        </w:rPr>
+        <w:t>Click on "tokenscope" app</w:t>
+        <w:br/>
+        <w:t>This opens the app dashboard showing:</w:t>
+        <w:br/>
+        <w:t xml:space="preserve">  - Current deployment status</w:t>
+        <w:br/>
+        <w:t xml:space="preserve">  - Service status</w:t>
+        <w:br/>
+        <w:t xml:space="preserve">  - Environment information</w:t>
+        <w:br/>
+        <w:t xml:space="preserve">  - GitHub connection status</w:t>
+      </w:r>
+    </w:p>
+    <w:p>
+      <w:r>
+        <w:rPr>
+          <w:b/>
+        </w:rPr>
+        <w:t>Step 3: Verify GitHub Connection is Active</w:t>
+      </w:r>
+    </w:p>
+    <w:p>
+      <w:pPr>
+        <w:pStyle w:val="NoSpacing"/>
+      </w:pPr>
+      <w:r>
+        <w:rPr>
+          <w:rFonts w:ascii="Courier New" w:hAnsi="Courier New"/>
+          <w:color w:val="404040"/>
+          <w:sz w:val="18"/>
+        </w:rPr>
+        <w:t>From app dashboard, click "Settings" tab</w:t>
+        <w:br/>
+        <w:t>Look for: "GitHub Deployment" or "Source"</w:t>
+        <w:br/>
+        <w:t>Should show:</w:t>
+        <w:br/>
+        <w:t xml:space="preserve">  - Repository: philcheevers-pixel/tokenscope</w:t>
+        <w:br/>
+        <w:t xml:space="preserve">  - Branch: main (or master if already connected)</w:t>
+        <w:br/>
+        <w:t xml:space="preserve">  - Status: Connected</w:t>
+        <w:br/>
+        <w:t xml:space="preserve">  - Webhook: Active</w:t>
+      </w:r>
+    </w:p>
+    <w:p>
+      <w:r>
+        <w:rPr>
+          <w:b/>
+        </w:rPr>
+        <w:t>Step 4: Check Deployment History</w:t>
+      </w:r>
+    </w:p>
+    <w:p>
+      <w:pPr>
+        <w:pStyle w:val="NoSpacing"/>
+      </w:pPr>
+      <w:r>
+        <w:rPr>
+          <w:rFonts w:ascii="Courier New" w:hAnsi="Courier New"/>
+          <w:color w:val="404040"/>
+          <w:sz w:val="18"/>
+        </w:rPr>
+        <w:t>From app dashboard, click "Deployments" tab</w:t>
+        <w:br/>
+        <w:t>You should see:</w:t>
+        <w:br/>
+        <w:t xml:space="preserve">  - Previous deployments listed with dates</w:t>
+        <w:br/>
+        <w:t xml:space="preserve">  - Status: "Active", "In Progress", or "Failed"</w:t>
+        <w:br/>
+        <w:t xml:space="preserve">  - Each deployment shows commit hash and message</w:t>
+        <w:br/>
+        <w:t xml:space="preserve">  - Click on any deployment to view build logs</w:t>
+      </w:r>
+    </w:p>
+    <w:p>
+      <w:r>
+        <w:rPr>
+          <w:b/>
+        </w:rPr>
+        <w:t>Step 5: Get Your Live App URL</w:t>
+      </w:r>
+    </w:p>
+    <w:p>
+      <w:pPr>
+        <w:pStyle w:val="NoSpacing"/>
+      </w:pPr>
+      <w:r>
+        <w:rPr>
+          <w:rFonts w:ascii="Courier New" w:hAnsi="Courier New"/>
+          <w:color w:val="404040"/>
+          <w:sz w:val="18"/>
+        </w:rPr>
+        <w:t>From app dashboard, top right shows:</w:t>
+        <w:br/>
+        <w:t xml:space="preserve">  "Live App" button → https://tokenscope-xxx.ondigitalocean.app</w:t>
+        <w:br/>
+        <w:t>Copy this URL for testing and sharing</w:t>
+      </w:r>
+    </w:p>
+    <w:p>
+      <w:r>
+        <w:rPr>
+          <w:b/>
+        </w:rPr>
+        <w:t>Step 6: What Happens When You Push to GitHub</w:t>
+      </w:r>
+    </w:p>
+    <w:p>
+      <w:r>
+        <w:t>After you push code to GitHub (which we just did):</w:t>
+      </w:r>
+    </w:p>
+    <w:p>
+      <w:r>
+        <w:t>1. **Immediately (0-30 seconds):**</w:t>
+      </w:r>
+    </w:p>
+    <w:p>
+      <w:r>
+        <w:t xml:space="preserve">   - GitHub sends webhook to DigitalOcean</w:t>
+      </w:r>
+    </w:p>
+    <w:p>
+      <w:r>
+        <w:t xml:space="preserve">   - DigitalOcean receives notification of new commit</w:t>
+      </w:r>
+    </w:p>
+    <w:p>
+      <w:r>
+        <w:t xml:space="preserve">   - Status: "Deploying..."</w:t>
+      </w:r>
+    </w:p>
+    <w:p>
+      <w:r>
+        <w:t>2. **Build Phase (1-2 minutes):**</w:t>
+      </w:r>
+    </w:p>
+    <w:p>
+      <w:r>
+        <w:t xml:space="preserve">   - DigitalOcean pulls latest code from GitHub</w:t>
+      </w:r>
+    </w:p>
+    <w:p>
+      <w:r>
+        <w:t xml:space="preserve">   - Runs `pip install -r requirements.txt`</w:t>
+      </w:r>
+    </w:p>
+    <w:p>
+      <w:r>
+        <w:t xml:space="preserve">   - Status: "Building..."</w:t>
+      </w:r>
+    </w:p>
+    <w:p>
+      <w:r>
+        <w:t xml:space="preserve">   - Check logs if build fails</w:t>
+      </w:r>
+    </w:p>
+    <w:p>
+      <w:r>
+        <w:t>3. **Deployment Phase (30 seconds - 1 minute):**</w:t>
+      </w:r>
+    </w:p>
+    <w:p>
+      <w:r>
+        <w:t xml:space="preserve">   - Runs `python backend.py`</w:t>
+      </w:r>
+    </w:p>
+    <w:p>
+      <w:r>
+        <w:t xml:space="preserve">   - Frontend HTML deployed</w:t>
+      </w:r>
+    </w:p>
+    <w:p>
+      <w:r>
+        <w:t xml:space="preserve">   - Status: "Deploying..."</w:t>
+      </w:r>
+    </w:p>
+    <w:p>
+      <w:r>
+        <w:t xml:space="preserve">   - Check logs if startup fails</w:t>
+      </w:r>
+    </w:p>
+    <w:p>
+      <w:r>
+        <w:t>4. **Live (Total: 2-5 minutes):**</w:t>
+      </w:r>
+    </w:p>
+    <w:p>
+      <w:r>
+        <w:t xml:space="preserve">   - App is live at https://tokenscope-xxx.ondigitalocean.app</w:t>
+      </w:r>
+    </w:p>
+    <w:p>
+      <w:r>
+        <w:t xml:space="preserve">   - Status: "Active"</w:t>
+      </w:r>
+    </w:p>
+    <w:p>
+      <w:r>
+        <w:t xml:space="preserve">   - Old deployment marked as "Superseded"</w:t>
+      </w:r>
+    </w:p>
+    <w:p>
+      <w:r>
+        <w:rPr>
+          <w:b/>
+        </w:rPr>
+        <w:t>Step 7: Monitor First Deployment</w:t>
+      </w:r>
+    </w:p>
+    <w:p>
+      <w:pPr>
+        <w:pStyle w:val="NoSpacing"/>
+      </w:pPr>
+      <w:r>
+        <w:rPr>
+          <w:rFonts w:ascii="Courier New" w:hAnsi="Courier New"/>
+          <w:color w:val="404040"/>
+          <w:sz w:val="18"/>
+        </w:rPr>
+        <w:t>1. Go to https://cloud.digitalocean.com/apps</w:t>
+        <w:br/>
+        <w:t>2. Click "tokenscope"</w:t>
+        <w:br/>
+        <w:t>3. Click "Deployments" tab</w:t>
+        <w:br/>
+        <w:t>4. Click latest deployment (at top)</w:t>
+        <w:br/>
+        <w:t>5. Watch the logs scroll in real-time</w:t>
+        <w:br/>
+        <w:t>6. Look for errors (red text)</w:t>
+        <w:br/>
+        <w:t>7. When "Active", deployment successful</w:t>
+      </w:r>
+    </w:p>
+    <w:p>
+      <w:r>
+        <w:rPr>
+          <w:b/>
+        </w:rPr>
+        <w:t>Step 8: Test Live Deployment</w:t>
+      </w:r>
+    </w:p>
+    <w:p>
+      <w:r>
+        <w:t>After app shows "Active":</w:t>
+      </w:r>
+    </w:p>
+    <w:p>
+      <w:pPr>
+        <w:pStyle w:val="NoSpacing"/>
+      </w:pPr>
+      <w:r>
+        <w:rPr>
+          <w:rFonts w:ascii="Courier New" w:hAnsi="Courier New"/>
+          <w:color w:val="404040"/>
+          <w:sz w:val="18"/>
+        </w:rPr>
+        <w:t># Test backend is running</w:t>
+        <w:br/>
+        <w:t>curl https://tokenscope-xxx.ondigitalocean.app/</w:t>
+        <w:br/>
+        <w:br/>
+        <w:t># Test frontend loads</w:t>
+        <w:br/>
+        <w:t>Open in browser: https://tokenscope-xxx.ondigitalocean.app/TokenScope-v11.0.html</w:t>
+        <w:br/>
+        <w:br/>
+        <w:t># Test API (with your API key)</w:t>
+        <w:br/>
+        <w:t>curl "https://tokenscope-xxx.ondigitalocean.app/api/claude/costs?key=YOUR_KEY"</w:t>
+      </w:r>
+    </w:p>
+    <w:p>
+      <w:r>
+        <w:rPr>
+          <w:b/>
+        </w:rPr>
+        <w:t>Step 9: Check Logs for Issues</w:t>
+      </w:r>
+    </w:p>
+    <w:p>
+      <w:r>
+        <w:t>If deployment fails or app doesn't respond:</w:t>
+      </w:r>
+    </w:p>
+    <w:p>
+      <w:pPr>
+        <w:pStyle w:val="NoSpacing"/>
+      </w:pPr>
+      <w:r>
+        <w:rPr>
+          <w:rFonts w:ascii="Courier New" w:hAnsi="Courier New"/>
+          <w:color w:val="404040"/>
+          <w:sz w:val="18"/>
+        </w:rPr>
+        <w:t>Dashboard → Apps → TokenScope → Deployments → Latest</w:t>
+        <w:br/>
+        <w:t>Click "Logs" tab and look for:</w:t>
+        <w:br/>
+        <w:t xml:space="preserve">  - [ERROR] lines (Python errors)</w:t>
+        <w:br/>
+        <w:t xml:space="preserve">  - Exit code 1 (crash)</w:t>
+        <w:br/>
+        <w:t xml:space="preserve">  - "port already in use" (conflict)</w:t>
+        <w:br/>
+        <w:t xml:space="preserve">  - "module not found" (missing dependency)</w:t>
       </w:r>
     </w:p>
     <w:p/>

</xml_diff>